<commit_message>
Align the jerky HACCP plan with 9 CFR 417, the FSIS guidebook, and the 2021 model.
Co-authored-by: quique2220-coder <quique2220-coder@users.noreply.github.com>
</commit_message>
<xml_diff>
--- a/haccp-plan/CHARTS-Diagrama-de-flujo.docx
+++ b/haccp-plan/CHARTS-Diagrama-de-flujo.docx
@@ -224,7 +224,167 @@
                 <w:color w:val="1E1A16"/>
                 <w:sz w:val="20"/>
               </w:rPr>
-              <w:t>Specification matches. No nitrite.</w:t>
+              <w:t>Specification matches. No nitrite. No soy. No wheat.</w:t>
+            </w:r>
+          </w:p>
+        </w:tc>
+      </w:tr>
+    </w:tbl>
+    <w:p>
+      <w:pPr>
+        <w:spacing w:before="0" w:after="0"/>
+        <w:jc w:val="center"/>
+      </w:pPr>
+      <w:r>
+        <w:rPr>
+          <w:rFonts w:ascii="Calibri" w:hAnsi="Calibri" w:eastAsia="Calibri"/>
+          <w:b/>
+          <w:i w:val="0"/>
+          <w:color w:val="1F4D36"/>
+          <w:sz w:val="28"/>
+        </w:rPr>
+        <w:t>↓</w:t>
+      </w:r>
+    </w:p>
+    <w:tbl>
+      <w:tblPr>
+        <w:tblW w:type="dxa" w:w="9072"/>
+        <w:tblLayout w:type="fixed"/>
+        <w:tblLook w:firstColumn="1" w:firstRow="1" w:lastColumn="0" w:lastRow="0" w:noHBand="0" w:noVBand="1" w:val="04A0"/>
+        <w:jc w:val="center"/>
+      </w:tblPr>
+      <w:tblGrid>
+        <w:gridCol w:w="10540"/>
+      </w:tblGrid>
+      <w:tr>
+        <w:tc>
+          <w:tcPr>
+            <w:tcW w:type="dxa" w:w="9072"/>
+            <w:shd w:fill="FFFDF9" w:val="clear"/>
+            <w:tcBorders>
+              <w:top w:val="single" w:sz="12" w:space="0" w:color="D9CFC3"/>
+              <w:left w:val="single" w:sz="12" w:space="0" w:color="D9CFC3"/>
+              <w:bottom w:val="single" w:sz="12" w:space="0" w:color="D9CFC3"/>
+              <w:right w:val="single" w:sz="12" w:space="0" w:color="D9CFC3"/>
+            </w:tcBorders>
+            <w:tcMar>
+              <w:top w:w="80" w:type="dxa"/>
+              <w:left w:w="120" w:type="dxa"/>
+              <w:bottom w:w="80" w:type="dxa"/>
+              <w:right w:w="120" w:type="dxa"/>
+            </w:tcMar>
+          </w:tcPr>
+          <w:p>
+            <w:pPr>
+              <w:spacing w:before="0" w:after="20" w:line="240" w:lineRule="auto"/>
+              <w:jc w:val="center"/>
+            </w:pPr>
+            <w:r/>
+            <w:r>
+              <w:rPr>
+                <w:rFonts w:ascii="Calibri" w:hAnsi="Calibri" w:eastAsia="Calibri"/>
+                <w:b/>
+                <w:i w:val="0"/>
+                <w:color w:val="1E1A16"/>
+                <w:sz w:val="24"/>
+              </w:rPr>
+              <w:t>3. Cold storage — not a CCP</w:t>
+            </w:r>
+          </w:p>
+          <w:p>
+            <w:pPr>
+              <w:spacing w:before="0" w:after="20" w:line="240" w:lineRule="auto"/>
+              <w:jc w:val="center"/>
+            </w:pPr>
+            <w:r>
+              <w:rPr>
+                <w:rFonts w:ascii="Calibri" w:hAnsi="Calibri" w:eastAsia="Calibri"/>
+                <w:b w:val="0"/>
+                <w:i w:val="0"/>
+                <w:color w:val="1E1A16"/>
+                <w:sz w:val="20"/>
+              </w:rPr>
+              <w:t>Product below 41°F. Prerequisite, stricter than the model’s 45°F.</w:t>
+            </w:r>
+          </w:p>
+        </w:tc>
+      </w:tr>
+    </w:tbl>
+    <w:p>
+      <w:pPr>
+        <w:spacing w:before="0" w:after="0"/>
+        <w:jc w:val="center"/>
+      </w:pPr>
+      <w:r>
+        <w:rPr>
+          <w:rFonts w:ascii="Calibri" w:hAnsi="Calibri" w:eastAsia="Calibri"/>
+          <w:b/>
+          <w:i w:val="0"/>
+          <w:color w:val="1F4D36"/>
+          <w:sz w:val="28"/>
+        </w:rPr>
+        <w:t>↓</w:t>
+      </w:r>
+    </w:p>
+    <w:tbl>
+      <w:tblPr>
+        <w:tblW w:type="dxa" w:w="9072"/>
+        <w:tblLayout w:type="fixed"/>
+        <w:tblLook w:firstColumn="1" w:firstRow="1" w:lastColumn="0" w:lastRow="0" w:noHBand="0" w:noVBand="1" w:val="04A0"/>
+        <w:jc w:val="center"/>
+      </w:tblPr>
+      <w:tblGrid>
+        <w:gridCol w:w="10540"/>
+      </w:tblGrid>
+      <w:tr>
+        <w:tc>
+          <w:tcPr>
+            <w:tcW w:type="dxa" w:w="9072"/>
+            <w:shd w:fill="FFFDF9" w:val="clear"/>
+            <w:tcBorders>
+              <w:top w:val="single" w:sz="12" w:space="0" w:color="D9CFC3"/>
+              <w:left w:val="single" w:sz="12" w:space="0" w:color="D9CFC3"/>
+              <w:bottom w:val="single" w:sz="12" w:space="0" w:color="D9CFC3"/>
+              <w:right w:val="single" w:sz="12" w:space="0" w:color="D9CFC3"/>
+            </w:tcBorders>
+            <w:tcMar>
+              <w:top w:w="80" w:type="dxa"/>
+              <w:left w:w="120" w:type="dxa"/>
+              <w:bottom w:w="80" w:type="dxa"/>
+              <w:right w:w="120" w:type="dxa"/>
+            </w:tcMar>
+          </w:tcPr>
+          <w:p>
+            <w:pPr>
+              <w:spacing w:before="0" w:after="20" w:line="240" w:lineRule="auto"/>
+              <w:jc w:val="center"/>
+            </w:pPr>
+            <w:r/>
+            <w:r>
+              <w:rPr>
+                <w:rFonts w:ascii="Calibri" w:hAnsi="Calibri" w:eastAsia="Calibri"/>
+                <w:b/>
+                <w:i w:val="0"/>
+                <w:color w:val="1E1A16"/>
+                <w:sz w:val="24"/>
+              </w:rPr>
+              <w:t>4. Slice, weigh, marinate, single layer</w:t>
+            </w:r>
+          </w:p>
+          <w:p>
+            <w:pPr>
+              <w:spacing w:before="0" w:after="20" w:line="240" w:lineRule="auto"/>
+              <w:jc w:val="center"/>
+            </w:pPr>
+            <w:r>
+              <w:rPr>
+                <w:rFonts w:ascii="Calibri" w:hAnsi="Calibri" w:eastAsia="Calibri"/>
+                <w:b w:val="0"/>
+                <w:i w:val="0"/>
+                <w:color w:val="1E1A16"/>
+                <w:sz w:val="20"/>
+              </w:rPr>
+              <w:t>Still below 41°F. Do not stack. Do not dry before the cook.</w:t>
             </w:r>
           </w:p>
         </w:tc>
@@ -288,23 +448,7 @@
                 <w:color w:val="FFFFFF"/>
                 <w:sz w:val="22"/>
               </w:rPr>
-              <w:t>CCP-1  ·  COOLER</w:t>
-            </w:r>
-          </w:p>
-          <w:p>
-            <w:pPr>
-              <w:spacing w:before="0" w:after="20" w:line="240" w:lineRule="auto"/>
-              <w:jc w:val="center"/>
-            </w:pPr>
-            <w:r>
-              <w:rPr>
-                <w:rFonts w:ascii="Calibri" w:hAnsi="Calibri" w:eastAsia="Calibri"/>
-                <w:b/>
-                <w:i w:val="0"/>
-                <w:color w:val="FFFFFF"/>
-                <w:sz w:val="24"/>
-              </w:rPr>
-              <w:t>Store and marinate the beef</w:t>
+              <w:t>CCP 1  ·  COOKING, BEFORE DRYING</w:t>
             </w:r>
           </w:p>
           <w:p>
@@ -320,7 +464,7 @@
                 <w:color w:val="FFFFFF"/>
                 <w:sz w:val="20"/>
               </w:rPr>
-              <w:t>Product temperature below 41°F (5°C)</w:t>
+              <w:t>Internal 145°F for at least 4 minutes</w:t>
             </w:r>
           </w:p>
           <w:p>
@@ -336,7 +480,167 @@
                 <w:color w:val="FFFFFF"/>
                 <w:sz w:val="20"/>
               </w:rPr>
-              <w:t>Probe the meat, not the cooler air</w:t>
+              <w:t>Wet bulb at least 125°F for at least 1 hour</w:t>
+            </w:r>
+          </w:p>
+          <w:p>
+            <w:pPr>
+              <w:spacing w:before="0" w:after="20" w:line="240" w:lineRule="auto"/>
+              <w:jc w:val="center"/>
+            </w:pPr>
+            <w:r>
+              <w:rPr>
+                <w:rFonts w:ascii="Calibri" w:hAnsi="Calibri" w:eastAsia="Calibri"/>
+                <w:b w:val="0"/>
+                <w:i w:val="0"/>
+                <w:color w:val="FFFFFF"/>
+                <w:sz w:val="20"/>
+              </w:rPr>
+              <w:t>Relative humidity at least 27% for at least 1 hour</w:t>
+            </w:r>
+          </w:p>
+          <w:p>
+            <w:pPr>
+              <w:spacing w:before="0" w:after="20" w:line="240" w:lineRule="auto"/>
+              <w:jc w:val="center"/>
+            </w:pPr>
+            <w:r>
+              <w:rPr>
+                <w:rFonts w:ascii="Calibri" w:hAnsi="Calibri" w:eastAsia="Calibri"/>
+                <w:b w:val="0"/>
+                <w:i w:val="0"/>
+                <w:color w:val="FFFFFF"/>
+                <w:sz w:val="20"/>
+              </w:rPr>
+              <w:t>Oven sealed for 1 hour or 50% of the cook, whichever is longer</w:t>
+            </w:r>
+          </w:p>
+          <w:p>
+            <w:pPr>
+              <w:spacing w:before="0" w:after="20" w:line="240" w:lineRule="auto"/>
+              <w:jc w:val="center"/>
+            </w:pPr>
+            <w:r>
+              <w:rPr>
+                <w:rFonts w:ascii="Calibri" w:hAnsi="Calibri" w:eastAsia="Calibri"/>
+                <w:b w:val="0"/>
+                <w:i w:val="0"/>
+                <w:color w:val="FFFFFF"/>
+                <w:sz w:val="20"/>
+              </w:rPr>
+              <w:t>Dampers closed within 30 minutes. Come-up 6 hours or less.</w:t>
+            </w:r>
+          </w:p>
+        </w:tc>
+      </w:tr>
+    </w:tbl>
+    <w:p>
+      <w:pPr>
+        <w:spacing w:before="0" w:after="0"/>
+        <w:jc w:val="center"/>
+      </w:pPr>
+      <w:r>
+        <w:rPr>
+          <w:rFonts w:ascii="Calibri" w:hAnsi="Calibri" w:eastAsia="Calibri"/>
+          <w:b/>
+          <w:i w:val="0"/>
+          <w:color w:val="1F4D36"/>
+          <w:sz w:val="28"/>
+        </w:rPr>
+        <w:t>↓</w:t>
+      </w:r>
+    </w:p>
+    <w:tbl>
+      <w:tblPr>
+        <w:tblW w:type="dxa" w:w="9072"/>
+        <w:tblLayout w:type="fixed"/>
+        <w:tblLook w:firstColumn="1" w:firstRow="1" w:lastColumn="0" w:lastRow="0" w:noHBand="0" w:noVBand="1" w:val="04A0"/>
+        <w:jc w:val="center"/>
+      </w:tblPr>
+      <w:tblGrid>
+        <w:gridCol w:w="10540"/>
+      </w:tblGrid>
+      <w:tr>
+        <w:tc>
+          <w:tcPr>
+            <w:tcW w:type="dxa" w:w="9072"/>
+            <w:shd w:fill="1F4D36" w:val="clear"/>
+            <w:tcBorders>
+              <w:top w:val="single" w:sz="12" w:space="0" w:color="1F4D36"/>
+              <w:left w:val="single" w:sz="12" w:space="0" w:color="1F4D36"/>
+              <w:bottom w:val="single" w:sz="12" w:space="0" w:color="1F4D36"/>
+              <w:right w:val="single" w:sz="12" w:space="0" w:color="1F4D36"/>
+            </w:tcBorders>
+            <w:tcMar>
+              <w:top w:w="80" w:type="dxa"/>
+              <w:left w:w="120" w:type="dxa"/>
+              <w:bottom w:w="80" w:type="dxa"/>
+              <w:right w:w="120" w:type="dxa"/>
+            </w:tcMar>
+          </w:tcPr>
+          <w:p>
+            <w:pPr>
+              <w:spacing w:before="0" w:after="20" w:line="240" w:lineRule="auto"/>
+              <w:jc w:val="center"/>
+            </w:pPr>
+            <w:r/>
+            <w:r>
+              <w:rPr>
+                <w:rFonts w:ascii="Calibri" w:hAnsi="Calibri" w:eastAsia="Calibri"/>
+                <w:b/>
+                <w:i w:val="0"/>
+                <w:color w:val="FFFFFF"/>
+                <w:sz w:val="22"/>
+              </w:rPr>
+              <w:t>CCP 2  ·  DRYING</w:t>
+            </w:r>
+          </w:p>
+          <w:p>
+            <w:pPr>
+              <w:spacing w:before="0" w:after="20" w:line="240" w:lineRule="auto"/>
+              <w:jc w:val="center"/>
+            </w:pPr>
+            <w:r>
+              <w:rPr>
+                <w:rFonts w:ascii="Calibri" w:hAnsi="Calibri" w:eastAsia="Calibri"/>
+                <w:b w:val="0"/>
+                <w:i w:val="0"/>
+                <w:color w:val="FFFFFF"/>
+                <w:sz w:val="20"/>
+              </w:rPr>
+              <w:t>Dry bulb at least 170°F during drying</w:t>
+            </w:r>
+          </w:p>
+          <w:p>
+            <w:pPr>
+              <w:spacing w:before="0" w:after="20" w:line="240" w:lineRule="auto"/>
+              <w:jc w:val="center"/>
+            </w:pPr>
+            <w:r>
+              <w:rPr>
+                <w:rFonts w:ascii="Calibri" w:hAnsi="Calibri" w:eastAsia="Calibri"/>
+                <w:b w:val="0"/>
+                <w:i w:val="0"/>
+                <w:color w:val="FFFFFF"/>
+                <w:sz w:val="20"/>
+              </w:rPr>
+              <w:t>Water activity 0.85 or less</w:t>
+            </w:r>
+          </w:p>
+          <w:p>
+            <w:pPr>
+              <w:spacing w:before="0" w:after="20" w:line="240" w:lineRule="auto"/>
+              <w:jc w:val="center"/>
+            </w:pPr>
+            <w:r>
+              <w:rPr>
+                <w:rFonts w:ascii="Calibri" w:hAnsi="Calibri" w:eastAsia="Calibri"/>
+                <w:b w:val="0"/>
+                <w:i w:val="0"/>
+                <w:color w:val="FFFFFF"/>
+                <w:sz w:val="20"/>
+              </w:rPr>
+              <w:t>At least six pieces. The highest reading is the result.</w:t>
             </w:r>
           </w:p>
         </w:tc>
@@ -400,7 +704,7 @@
                 <w:color w:val="1E1A16"/>
                 <w:sz w:val="24"/>
               </w:rPr>
-              <w:t>3. Slice</w:t>
+              <w:t>5. Cool dry, pack, and label</w:t>
             </w:r>
           </w:p>
           <w:p>
@@ -416,7 +720,7 @@
                 <w:color w:val="1E1A16"/>
                 <w:sz w:val="20"/>
               </w:rPr>
-              <w:t>Record thickness on the batch sheet.</w:t>
+              <w:t>Do not rinse. Only if both CCPs passed. Lot code on the bag.</w:t>
             </w:r>
           </w:p>
         </w:tc>
@@ -480,7 +784,7 @@
                 <w:color w:val="1E1A16"/>
                 <w:sz w:val="24"/>
               </w:rPr>
-              <w:t>4. Weigh the batch and mix</w:t>
+              <w:t>6. Review the numbers and sign</w:t>
             </w:r>
           </w:p>
           <w:p>
@@ -496,551 +800,7 @@
                 <w:color w:val="1E1A16"/>
                 <w:sz w:val="20"/>
               </w:rPr>
-              <w:t>Beef, salt, and the spices on the batch sheet.</w:t>
-            </w:r>
-          </w:p>
-        </w:tc>
-      </w:tr>
-    </w:tbl>
-    <w:p>
-      <w:pPr>
-        <w:spacing w:before="0" w:after="0"/>
-        <w:jc w:val="center"/>
-      </w:pPr>
-      <w:r>
-        <w:rPr>
-          <w:rFonts w:ascii="Calibri" w:hAnsi="Calibri" w:eastAsia="Calibri"/>
-          <w:b/>
-          <w:i w:val="0"/>
-          <w:color w:val="1F4D36"/>
-          <w:sz w:val="28"/>
-        </w:rPr>
-        <w:t>↓</w:t>
-      </w:r>
-    </w:p>
-    <w:tbl>
-      <w:tblPr>
-        <w:tblW w:type="dxa" w:w="9072"/>
-        <w:tblLayout w:type="fixed"/>
-        <w:tblLook w:firstColumn="1" w:firstRow="1" w:lastColumn="0" w:lastRow="0" w:noHBand="0" w:noVBand="1" w:val="04A0"/>
-        <w:jc w:val="center"/>
-      </w:tblPr>
-      <w:tblGrid>
-        <w:gridCol w:w="10540"/>
-      </w:tblGrid>
-      <w:tr>
-        <w:tc>
-          <w:tcPr>
-            <w:tcW w:type="dxa" w:w="9072"/>
-            <w:shd w:fill="FFFDF9" w:val="clear"/>
-            <w:tcBorders>
-              <w:top w:val="single" w:sz="12" w:space="0" w:color="D9CFC3"/>
-              <w:left w:val="single" w:sz="12" w:space="0" w:color="D9CFC3"/>
-              <w:bottom w:val="single" w:sz="12" w:space="0" w:color="D9CFC3"/>
-              <w:right w:val="single" w:sz="12" w:space="0" w:color="D9CFC3"/>
-            </w:tcBorders>
-            <w:tcMar>
-              <w:top w:w="80" w:type="dxa"/>
-              <w:left w:w="120" w:type="dxa"/>
-              <w:bottom w:w="80" w:type="dxa"/>
-              <w:right w:w="120" w:type="dxa"/>
-            </w:tcMar>
-          </w:tcPr>
-          <w:p>
-            <w:pPr>
-              <w:spacing w:before="0" w:after="20" w:line="240" w:lineRule="auto"/>
-              <w:jc w:val="center"/>
-            </w:pPr>
-            <w:r/>
-            <w:r>
-              <w:rPr>
-                <w:rFonts w:ascii="Calibri" w:hAnsi="Calibri" w:eastAsia="Calibri"/>
-                <w:b/>
-                <w:i w:val="0"/>
-                <w:color w:val="1E1A16"/>
-                <w:sz w:val="24"/>
-              </w:rPr>
-              <w:t>5. Single layer on racks</w:t>
-            </w:r>
-          </w:p>
-          <w:p>
-            <w:pPr>
-              <w:spacing w:before="0" w:after="20" w:line="240" w:lineRule="auto"/>
-              <w:jc w:val="center"/>
-            </w:pPr>
-            <w:r>
-              <w:rPr>
-                <w:rFonts w:ascii="Calibri" w:hAnsi="Calibri" w:eastAsia="Calibri"/>
-                <w:b w:val="0"/>
-                <w:i w:val="0"/>
-                <w:color w:val="1E1A16"/>
-                <w:sz w:val="20"/>
-              </w:rPr>
-              <w:t>Do not stack. Do not dry before the cook.</w:t>
-            </w:r>
-          </w:p>
-        </w:tc>
-      </w:tr>
-    </w:tbl>
-    <w:p>
-      <w:pPr>
-        <w:spacing w:before="0" w:after="0"/>
-        <w:jc w:val="center"/>
-      </w:pPr>
-      <w:r>
-        <w:rPr>
-          <w:rFonts w:ascii="Calibri" w:hAnsi="Calibri" w:eastAsia="Calibri"/>
-          <w:b/>
-          <w:i w:val="0"/>
-          <w:color w:val="1F4D36"/>
-          <w:sz w:val="28"/>
-        </w:rPr>
-        <w:t>↓</w:t>
-      </w:r>
-    </w:p>
-    <w:tbl>
-      <w:tblPr>
-        <w:tblW w:type="dxa" w:w="9072"/>
-        <w:tblLayout w:type="fixed"/>
-        <w:tblLook w:firstColumn="1" w:firstRow="1" w:lastColumn="0" w:lastRow="0" w:noHBand="0" w:noVBand="1" w:val="04A0"/>
-        <w:jc w:val="center"/>
-      </w:tblPr>
-      <w:tblGrid>
-        <w:gridCol w:w="10540"/>
-      </w:tblGrid>
-      <w:tr>
-        <w:tc>
-          <w:tcPr>
-            <w:tcW w:type="dxa" w:w="9072"/>
-            <w:shd w:fill="1F4D36" w:val="clear"/>
-            <w:tcBorders>
-              <w:top w:val="single" w:sz="12" w:space="0" w:color="1F4D36"/>
-              <w:left w:val="single" w:sz="12" w:space="0" w:color="1F4D36"/>
-              <w:bottom w:val="single" w:sz="12" w:space="0" w:color="1F4D36"/>
-              <w:right w:val="single" w:sz="12" w:space="0" w:color="1F4D36"/>
-            </w:tcBorders>
-            <w:tcMar>
-              <w:top w:w="80" w:type="dxa"/>
-              <w:left w:w="120" w:type="dxa"/>
-              <w:bottom w:w="80" w:type="dxa"/>
-              <w:right w:w="120" w:type="dxa"/>
-            </w:tcMar>
-          </w:tcPr>
-          <w:p>
-            <w:pPr>
-              <w:spacing w:before="0" w:after="20" w:line="240" w:lineRule="auto"/>
-              <w:jc w:val="center"/>
-            </w:pPr>
-            <w:r/>
-            <w:r>
-              <w:rPr>
-                <w:rFonts w:ascii="Calibri" w:hAnsi="Calibri" w:eastAsia="Calibri"/>
-                <w:b/>
-                <w:i w:val="0"/>
-                <w:color w:val="FFFFFF"/>
-                <w:sz w:val="22"/>
-              </w:rPr>
-              <w:t>CCP-2  ·  HUMID COOK, BEFORE DRYING</w:t>
-            </w:r>
-          </w:p>
-          <w:p>
-            <w:pPr>
-              <w:spacing w:before="0" w:after="20" w:line="240" w:lineRule="auto"/>
-              <w:jc w:val="center"/>
-            </w:pPr>
-            <w:r>
-              <w:rPr>
-                <w:rFonts w:ascii="Calibri" w:hAnsi="Calibri" w:eastAsia="Calibri"/>
-                <w:b w:val="0"/>
-                <w:i w:val="0"/>
-                <w:color w:val="FFFFFF"/>
-                <w:sz w:val="20"/>
-              </w:rPr>
-              <w:t>Dry bulb above 170°F within 30 minutes</w:t>
-            </w:r>
-          </w:p>
-          <w:p>
-            <w:pPr>
-              <w:spacing w:before="0" w:after="20" w:line="240" w:lineRule="auto"/>
-              <w:jc w:val="center"/>
-            </w:pPr>
-            <w:r>
-              <w:rPr>
-                <w:rFonts w:ascii="Calibri" w:hAnsi="Calibri" w:eastAsia="Calibri"/>
-                <w:b w:val="0"/>
-                <w:i w:val="0"/>
-                <w:color w:val="FFFFFF"/>
-                <w:sz w:val="20"/>
-              </w:rPr>
-              <w:t>Wet bulb from 125°F to 142°F</w:t>
-            </w:r>
-          </w:p>
-          <w:p>
-            <w:pPr>
-              <w:spacing w:before="0" w:after="20" w:line="240" w:lineRule="auto"/>
-              <w:jc w:val="center"/>
-            </w:pPr>
-            <w:r>
-              <w:rPr>
-                <w:rFonts w:ascii="Calibri" w:hAnsi="Calibri" w:eastAsia="Calibri"/>
-                <w:b w:val="0"/>
-                <w:i w:val="0"/>
-                <w:color w:val="FFFFFF"/>
-                <w:sz w:val="20"/>
-              </w:rPr>
-              <w:t>Internal 158°F or above, thickest piece</w:t>
-            </w:r>
-          </w:p>
-          <w:p>
-            <w:pPr>
-              <w:spacing w:before="0" w:after="20" w:line="240" w:lineRule="auto"/>
-              <w:jc w:val="center"/>
-            </w:pPr>
-            <w:r>
-              <w:rPr>
-                <w:rFonts w:ascii="Calibri" w:hAnsi="Calibri" w:eastAsia="Calibri"/>
-                <w:b w:val="0"/>
-                <w:i w:val="0"/>
-                <w:color w:val="FFFFFF"/>
-                <w:sz w:val="20"/>
-              </w:rPr>
-              <w:t>From 50°F to 130°F: 6 hours or less</w:t>
-            </w:r>
-          </w:p>
-        </w:tc>
-      </w:tr>
-    </w:tbl>
-    <w:p>
-      <w:pPr>
-        <w:spacing w:before="0" w:after="0"/>
-        <w:jc w:val="center"/>
-      </w:pPr>
-      <w:r>
-        <w:rPr>
-          <w:rFonts w:ascii="Calibri" w:hAnsi="Calibri" w:eastAsia="Calibri"/>
-          <w:b/>
-          <w:i w:val="0"/>
-          <w:color w:val="1F4D36"/>
-          <w:sz w:val="28"/>
-        </w:rPr>
-        <w:t>↓</w:t>
-      </w:r>
-    </w:p>
-    <w:tbl>
-      <w:tblPr>
-        <w:tblW w:type="dxa" w:w="9072"/>
-        <w:tblLayout w:type="fixed"/>
-        <w:tblLook w:firstColumn="1" w:firstRow="1" w:lastColumn="0" w:lastRow="0" w:noHBand="0" w:noVBand="1" w:val="04A0"/>
-        <w:jc w:val="center"/>
-      </w:tblPr>
-      <w:tblGrid>
-        <w:gridCol w:w="10540"/>
-      </w:tblGrid>
-      <w:tr>
-        <w:tc>
-          <w:tcPr>
-            <w:tcW w:type="dxa" w:w="9072"/>
-            <w:shd w:fill="1F4D36" w:val="clear"/>
-            <w:tcBorders>
-              <w:top w:val="single" w:sz="12" w:space="0" w:color="1F4D36"/>
-              <w:left w:val="single" w:sz="12" w:space="0" w:color="1F4D36"/>
-              <w:bottom w:val="single" w:sz="12" w:space="0" w:color="1F4D36"/>
-              <w:right w:val="single" w:sz="12" w:space="0" w:color="1F4D36"/>
-            </w:tcBorders>
-            <w:tcMar>
-              <w:top w:w="80" w:type="dxa"/>
-              <w:left w:w="120" w:type="dxa"/>
-              <w:bottom w:w="80" w:type="dxa"/>
-              <w:right w:w="120" w:type="dxa"/>
-            </w:tcMar>
-          </w:tcPr>
-          <w:p>
-            <w:pPr>
-              <w:spacing w:before="0" w:after="20" w:line="240" w:lineRule="auto"/>
-              <w:jc w:val="center"/>
-            </w:pPr>
-            <w:r/>
-            <w:r>
-              <w:rPr>
-                <w:rFonts w:ascii="Calibri" w:hAnsi="Calibri" w:eastAsia="Calibri"/>
-                <w:b/>
-                <w:i w:val="0"/>
-                <w:color w:val="FFFFFF"/>
-                <w:sz w:val="22"/>
-              </w:rPr>
-              <w:t>CCP-3  ·  DRYING</w:t>
-            </w:r>
-          </w:p>
-          <w:p>
-            <w:pPr>
-              <w:spacing w:before="0" w:after="20" w:line="240" w:lineRule="auto"/>
-              <w:jc w:val="center"/>
-            </w:pPr>
-            <w:r>
-              <w:rPr>
-                <w:rFonts w:ascii="Calibri" w:hAnsi="Calibri" w:eastAsia="Calibri"/>
-                <w:b w:val="0"/>
-                <w:i w:val="0"/>
-                <w:color w:val="FFFFFF"/>
-                <w:sz w:val="20"/>
-              </w:rPr>
-              <w:t>Water activity below 0.88</w:t>
-            </w:r>
-          </w:p>
-          <w:p>
-            <w:pPr>
-              <w:spacing w:before="0" w:after="20" w:line="240" w:lineRule="auto"/>
-              <w:jc w:val="center"/>
-            </w:pPr>
-            <w:r>
-              <w:rPr>
-                <w:rFonts w:ascii="Calibri" w:hAnsi="Calibri" w:eastAsia="Calibri"/>
-                <w:b w:val="0"/>
-                <w:i w:val="0"/>
-                <w:color w:val="FFFFFF"/>
-                <w:sz w:val="20"/>
-              </w:rPr>
-              <w:t>Three pieces. The highest reading is the result.</w:t>
-            </w:r>
-          </w:p>
-        </w:tc>
-      </w:tr>
-    </w:tbl>
-    <w:p>
-      <w:pPr>
-        <w:spacing w:before="0" w:after="0"/>
-        <w:jc w:val="center"/>
-      </w:pPr>
-      <w:r>
-        <w:rPr>
-          <w:rFonts w:ascii="Calibri" w:hAnsi="Calibri" w:eastAsia="Calibri"/>
-          <w:b/>
-          <w:i w:val="0"/>
-          <w:color w:val="1F4D36"/>
-          <w:sz w:val="28"/>
-        </w:rPr>
-        <w:t>↓</w:t>
-      </w:r>
-    </w:p>
-    <w:tbl>
-      <w:tblPr>
-        <w:tblW w:type="dxa" w:w="9072"/>
-        <w:tblLayout w:type="fixed"/>
-        <w:tblLook w:firstColumn="1" w:firstRow="1" w:lastColumn="0" w:lastRow="0" w:noHBand="0" w:noVBand="1" w:val="04A0"/>
-        <w:jc w:val="center"/>
-      </w:tblPr>
-      <w:tblGrid>
-        <w:gridCol w:w="10540"/>
-      </w:tblGrid>
-      <w:tr>
-        <w:tc>
-          <w:tcPr>
-            <w:tcW w:type="dxa" w:w="9072"/>
-            <w:shd w:fill="FFFDF9" w:val="clear"/>
-            <w:tcBorders>
-              <w:top w:val="single" w:sz="12" w:space="0" w:color="D9CFC3"/>
-              <w:left w:val="single" w:sz="12" w:space="0" w:color="D9CFC3"/>
-              <w:bottom w:val="single" w:sz="12" w:space="0" w:color="D9CFC3"/>
-              <w:right w:val="single" w:sz="12" w:space="0" w:color="D9CFC3"/>
-            </w:tcBorders>
-            <w:tcMar>
-              <w:top w:w="80" w:type="dxa"/>
-              <w:left w:w="120" w:type="dxa"/>
-              <w:bottom w:w="80" w:type="dxa"/>
-              <w:right w:w="120" w:type="dxa"/>
-            </w:tcMar>
-          </w:tcPr>
-          <w:p>
-            <w:pPr>
-              <w:spacing w:before="0" w:after="20" w:line="240" w:lineRule="auto"/>
-              <w:jc w:val="center"/>
-            </w:pPr>
-            <w:r/>
-            <w:r>
-              <w:rPr>
-                <w:rFonts w:ascii="Calibri" w:hAnsi="Calibri" w:eastAsia="Calibri"/>
-                <w:b/>
-                <w:i w:val="0"/>
-                <w:color w:val="1E1A16"/>
-                <w:sz w:val="24"/>
-              </w:rPr>
-              <w:t>6. Cool dry</w:t>
-            </w:r>
-          </w:p>
-          <w:p>
-            <w:pPr>
-              <w:spacing w:before="0" w:after="20" w:line="240" w:lineRule="auto"/>
-              <w:jc w:val="center"/>
-            </w:pPr>
-            <w:r>
-              <w:rPr>
-                <w:rFonts w:ascii="Calibri" w:hAnsi="Calibri" w:eastAsia="Calibri"/>
-                <w:b w:val="0"/>
-                <w:i w:val="0"/>
-                <w:color w:val="1E1A16"/>
-                <w:sz w:val="20"/>
-              </w:rPr>
-              <w:t>Do not rinse or mist.</w:t>
-            </w:r>
-          </w:p>
-        </w:tc>
-      </w:tr>
-    </w:tbl>
-    <w:p>
-      <w:pPr>
-        <w:spacing w:before="0" w:after="0"/>
-        <w:jc w:val="center"/>
-      </w:pPr>
-      <w:r>
-        <w:rPr>
-          <w:rFonts w:ascii="Calibri" w:hAnsi="Calibri" w:eastAsia="Calibri"/>
-          <w:b/>
-          <w:i w:val="0"/>
-          <w:color w:val="1F4D36"/>
-          <w:sz w:val="28"/>
-        </w:rPr>
-        <w:t>↓</w:t>
-      </w:r>
-    </w:p>
-    <w:tbl>
-      <w:tblPr>
-        <w:tblW w:type="dxa" w:w="9072"/>
-        <w:tblLayout w:type="fixed"/>
-        <w:tblLook w:firstColumn="1" w:firstRow="1" w:lastColumn="0" w:lastRow="0" w:noHBand="0" w:noVBand="1" w:val="04A0"/>
-        <w:jc w:val="center"/>
-      </w:tblPr>
-      <w:tblGrid>
-        <w:gridCol w:w="10540"/>
-      </w:tblGrid>
-      <w:tr>
-        <w:tc>
-          <w:tcPr>
-            <w:tcW w:type="dxa" w:w="9072"/>
-            <w:shd w:fill="FFFDF9" w:val="clear"/>
-            <w:tcBorders>
-              <w:top w:val="single" w:sz="12" w:space="0" w:color="D9CFC3"/>
-              <w:left w:val="single" w:sz="12" w:space="0" w:color="D9CFC3"/>
-              <w:bottom w:val="single" w:sz="12" w:space="0" w:color="D9CFC3"/>
-              <w:right w:val="single" w:sz="12" w:space="0" w:color="D9CFC3"/>
-            </w:tcBorders>
-            <w:tcMar>
-              <w:top w:w="80" w:type="dxa"/>
-              <w:left w:w="120" w:type="dxa"/>
-              <w:bottom w:w="80" w:type="dxa"/>
-              <w:right w:w="120" w:type="dxa"/>
-            </w:tcMar>
-          </w:tcPr>
-          <w:p>
-            <w:pPr>
-              <w:spacing w:before="0" w:after="20" w:line="240" w:lineRule="auto"/>
-              <w:jc w:val="center"/>
-            </w:pPr>
-            <w:r/>
-            <w:r>
-              <w:rPr>
-                <w:rFonts w:ascii="Calibri" w:hAnsi="Calibri" w:eastAsia="Calibri"/>
-                <w:b/>
-                <w:i w:val="0"/>
-                <w:color w:val="1E1A16"/>
-                <w:sz w:val="24"/>
-              </w:rPr>
-              <w:t>7. Pack and label</w:t>
-            </w:r>
-          </w:p>
-          <w:p>
-            <w:pPr>
-              <w:spacing w:before="0" w:after="20" w:line="240" w:lineRule="auto"/>
-              <w:jc w:val="center"/>
-            </w:pPr>
-            <w:r>
-              <w:rPr>
-                <w:rFonts w:ascii="Calibri" w:hAnsi="Calibri" w:eastAsia="Calibri"/>
-                <w:b w:val="0"/>
-                <w:i w:val="0"/>
-                <w:color w:val="1E1A16"/>
-                <w:sz w:val="20"/>
-              </w:rPr>
-              <w:t>Only if all three CCPs passed. Bag marked with the lot.</w:t>
-            </w:r>
-          </w:p>
-        </w:tc>
-      </w:tr>
-    </w:tbl>
-    <w:p>
-      <w:pPr>
-        <w:spacing w:before="0" w:after="0"/>
-        <w:jc w:val="center"/>
-      </w:pPr>
-      <w:r>
-        <w:rPr>
-          <w:rFonts w:ascii="Calibri" w:hAnsi="Calibri" w:eastAsia="Calibri"/>
-          <w:b/>
-          <w:i w:val="0"/>
-          <w:color w:val="1F4D36"/>
-          <w:sz w:val="28"/>
-        </w:rPr>
-        <w:t>↓</w:t>
-      </w:r>
-    </w:p>
-    <w:tbl>
-      <w:tblPr>
-        <w:tblW w:type="dxa" w:w="9072"/>
-        <w:tblLayout w:type="fixed"/>
-        <w:tblLook w:firstColumn="1" w:firstRow="1" w:lastColumn="0" w:lastRow="0" w:noHBand="0" w:noVBand="1" w:val="04A0"/>
-        <w:jc w:val="center"/>
-      </w:tblPr>
-      <w:tblGrid>
-        <w:gridCol w:w="10540"/>
-      </w:tblGrid>
-      <w:tr>
-        <w:tc>
-          <w:tcPr>
-            <w:tcW w:type="dxa" w:w="9072"/>
-            <w:shd w:fill="FFFDF9" w:val="clear"/>
-            <w:tcBorders>
-              <w:top w:val="single" w:sz="12" w:space="0" w:color="D9CFC3"/>
-              <w:left w:val="single" w:sz="12" w:space="0" w:color="D9CFC3"/>
-              <w:bottom w:val="single" w:sz="12" w:space="0" w:color="D9CFC3"/>
-              <w:right w:val="single" w:sz="12" w:space="0" w:color="D9CFC3"/>
-            </w:tcBorders>
-            <w:tcMar>
-              <w:top w:w="80" w:type="dxa"/>
-              <w:left w:w="120" w:type="dxa"/>
-              <w:bottom w:w="80" w:type="dxa"/>
-              <w:right w:w="120" w:type="dxa"/>
-            </w:tcMar>
-          </w:tcPr>
-          <w:p>
-            <w:pPr>
-              <w:spacing w:before="0" w:after="20" w:line="240" w:lineRule="auto"/>
-              <w:jc w:val="center"/>
-            </w:pPr>
-            <w:r/>
-            <w:r>
-              <w:rPr>
-                <w:rFonts w:ascii="Calibri" w:hAnsi="Calibri" w:eastAsia="Calibri"/>
-                <w:b/>
-                <w:i w:val="0"/>
-                <w:color w:val="1E1A16"/>
-                <w:sz w:val="24"/>
-              </w:rPr>
-              <w:t>8. Review the numbers and sign</w:t>
-            </w:r>
-          </w:p>
-          <w:p>
-            <w:pPr>
-              <w:spacing w:before="0" w:after="20" w:line="240" w:lineRule="auto"/>
-              <w:jc w:val="center"/>
-            </w:pPr>
-            <w:r>
-              <w:rPr>
-                <w:rFonts w:ascii="Calibri" w:hAnsi="Calibri" w:eastAsia="Calibri"/>
-                <w:b w:val="0"/>
-                <w:i w:val="0"/>
-                <w:color w:val="1E1A16"/>
-                <w:sz w:val="20"/>
-              </w:rPr>
-              <w:t>Each number is compared with its limit. Then dry storage.</w:t>
+              <w:t>Pre-shipment review under 9 CFR 417.5(c). Then dry storage.</w:t>
             </w:r>
           </w:p>
         </w:tc>
@@ -1103,7 +863,7 @@
                 <w:color w:val="8C3D24"/>
                 <w:sz w:val="22"/>
               </w:rPr>
-              <w:t>If a limit is missed, the lot is held and is not sold as ready-to-eat beef jerky.</w:t>
+              <w:t>If a CCP limit is missed, the lot is held and is not sold as ready-to-eat beef jerky.</w:t>
             </w:r>
           </w:p>
         </w:tc>
@@ -1142,7 +902,7 @@
           <w:color w:val="1E1A16"/>
           <w:sz w:val="24"/>
         </w:rPr>
-        <w:t>What is written for each lot, before it is sold</w:t>
+        <w:t>From the FSIS beef jerky HACCP model, 2021-0004, and Appendix A</w:t>
       </w:r>
     </w:p>
     <w:tbl>
@@ -1232,7 +992,7 @@
                 <w:color w:val="1E1A16"/>
                 <w:sz w:val="22"/>
               </w:rPr>
-              <w:t>CCP-1 Cooler</w:t>
+              <w:t>Prerequisite</w:t>
             </w:r>
           </w:p>
         </w:tc>
@@ -1268,7 +1028,7 @@
                 <w:color w:val="1E1A16"/>
                 <w:sz w:val="22"/>
               </w:rPr>
-              <w:t>Below 41°F (5°C)</w:t>
+              <w:t>Below 41°F. Not a CCP.</w:t>
             </w:r>
           </w:p>
         </w:tc>
@@ -1289,122 +1049,7 @@
                 <w:color w:val="1E1A16"/>
                 <w:sz w:val="22"/>
               </w:rPr>
-              <w:t>CCP-2 Cook</w:t>
-            </w:r>
-          </w:p>
-        </w:tc>
-        <w:tc>
-          <w:tcPr>
-            <w:tcW w:type="dxa" w:w="9504"/>
-            <w:shd w:fill="F4F1EA" w:val="clear"/>
-          </w:tcPr>
-          <w:p>
-            <w:r/>
-            <w:r>
-              <w:rPr>
-                <w:rFonts w:ascii="Calibri" w:hAnsi="Calibri" w:eastAsia="Calibri"/>
-                <w:b w:val="0"/>
-                <w:i w:val="0"/>
-                <w:color w:val="1E1A16"/>
-                <w:sz w:val="22"/>
-              </w:rPr>
-              <w:t>Dry bulb</w:t>
-            </w:r>
-          </w:p>
-        </w:tc>
-        <w:tc>
-          <w:tcPr>
-            <w:tcW w:type="dxa" w:w="9504"/>
-            <w:shd w:fill="F4F1EA" w:val="clear"/>
-          </w:tcPr>
-          <w:p>
-            <w:r/>
-            <w:r>
-              <w:rPr>
-                <w:rFonts w:ascii="Calibri" w:hAnsi="Calibri" w:eastAsia="Calibri"/>
-                <w:b w:val="0"/>
-                <w:i w:val="0"/>
-                <w:color w:val="1E1A16"/>
-                <w:sz w:val="22"/>
-              </w:rPr>
-              <w:t>Above 170°F within the first 30 minutes</w:t>
-            </w:r>
-          </w:p>
-        </w:tc>
-      </w:tr>
-      <w:tr>
-        <w:tc>
-          <w:tcPr>
-            <w:tcW w:type="dxa" w:w="9504"/>
-          </w:tcPr>
-          <w:p>
-            <w:r/>
-            <w:r>
-              <w:rPr>
-                <w:rFonts w:ascii="Calibri" w:hAnsi="Calibri" w:eastAsia="Calibri"/>
-                <w:b/>
-                <w:i w:val="0"/>
-                <w:color w:val="1E1A16"/>
-                <w:sz w:val="22"/>
-              </w:rPr>
-              <w:t>CCP-2 Cook</w:t>
-            </w:r>
-          </w:p>
-        </w:tc>
-        <w:tc>
-          <w:tcPr>
-            <w:tcW w:type="dxa" w:w="9504"/>
-          </w:tcPr>
-          <w:p>
-            <w:r/>
-            <w:r>
-              <w:rPr>
-                <w:rFonts w:ascii="Calibri" w:hAnsi="Calibri" w:eastAsia="Calibri"/>
-                <w:b w:val="0"/>
-                <w:i w:val="0"/>
-                <w:color w:val="1E1A16"/>
-                <w:sz w:val="22"/>
-              </w:rPr>
-              <w:t>Wet bulb</w:t>
-            </w:r>
-          </w:p>
-        </w:tc>
-        <w:tc>
-          <w:tcPr>
-            <w:tcW w:type="dxa" w:w="9504"/>
-          </w:tcPr>
-          <w:p>
-            <w:r/>
-            <w:r>
-              <w:rPr>
-                <w:rFonts w:ascii="Calibri" w:hAnsi="Calibri" w:eastAsia="Calibri"/>
-                <w:b w:val="0"/>
-                <w:i w:val="0"/>
-                <w:color w:val="1E1A16"/>
-                <w:sz w:val="22"/>
-              </w:rPr>
-              <w:t>From 125°F to 142°F during the cook</w:t>
-            </w:r>
-          </w:p>
-        </w:tc>
-      </w:tr>
-      <w:tr>
-        <w:tc>
-          <w:tcPr>
-            <w:tcW w:type="dxa" w:w="9504"/>
-            <w:shd w:fill="F4F1EA" w:val="clear"/>
-          </w:tcPr>
-          <w:p>
-            <w:r/>
-            <w:r>
-              <w:rPr>
-                <w:rFonts w:ascii="Calibri" w:hAnsi="Calibri" w:eastAsia="Calibri"/>
-                <w:b/>
-                <w:i w:val="0"/>
-                <w:color w:val="1E1A16"/>
-                <w:sz w:val="22"/>
-              </w:rPr>
-              <w:t>CCP-2 Cook</w:t>
+              <w:t>CCP 1 Cooking</w:t>
             </w:r>
           </w:p>
         </w:tc>
@@ -1442,7 +1087,7 @@
                 <w:color w:val="1E1A16"/>
                 <w:sz w:val="22"/>
               </w:rPr>
-              <w:t>158°F or above. The lowest reading.</w:t>
+              <w:t>145°F or above for at least 4 minutes</w:t>
             </w:r>
           </w:p>
         </w:tc>
@@ -1462,13 +1107,186 @@
                 <w:color w:val="1E1A16"/>
                 <w:sz w:val="22"/>
               </w:rPr>
-              <w:t>CCP-2 Cook</w:t>
+              <w:t>CCP 1 Cooking</w:t>
             </w:r>
           </w:p>
         </w:tc>
         <w:tc>
           <w:tcPr>
             <w:tcW w:type="dxa" w:w="9504"/>
+          </w:tcPr>
+          <w:p>
+            <w:r/>
+            <w:r>
+              <w:rPr>
+                <w:rFonts w:ascii="Calibri" w:hAnsi="Calibri" w:eastAsia="Calibri"/>
+                <w:b w:val="0"/>
+                <w:i w:val="0"/>
+                <w:color w:val="1E1A16"/>
+                <w:sz w:val="22"/>
+              </w:rPr>
+              <w:t>Wet bulb</w:t>
+            </w:r>
+          </w:p>
+        </w:tc>
+        <w:tc>
+          <w:tcPr>
+            <w:tcW w:type="dxa" w:w="9504"/>
+          </w:tcPr>
+          <w:p>
+            <w:r/>
+            <w:r>
+              <w:rPr>
+                <w:rFonts w:ascii="Calibri" w:hAnsi="Calibri" w:eastAsia="Calibri"/>
+                <w:b w:val="0"/>
+                <w:i w:val="0"/>
+                <w:color w:val="1E1A16"/>
+                <w:sz w:val="22"/>
+              </w:rPr>
+              <w:t>At least 125°F for at least 1 hour</w:t>
+            </w:r>
+          </w:p>
+        </w:tc>
+      </w:tr>
+      <w:tr>
+        <w:tc>
+          <w:tcPr>
+            <w:tcW w:type="dxa" w:w="9504"/>
+            <w:shd w:fill="F4F1EA" w:val="clear"/>
+          </w:tcPr>
+          <w:p>
+            <w:r/>
+            <w:r>
+              <w:rPr>
+                <w:rFonts w:ascii="Calibri" w:hAnsi="Calibri" w:eastAsia="Calibri"/>
+                <w:b/>
+                <w:i w:val="0"/>
+                <w:color w:val="1E1A16"/>
+                <w:sz w:val="22"/>
+              </w:rPr>
+              <w:t>CCP 1 Cooking</w:t>
+            </w:r>
+          </w:p>
+        </w:tc>
+        <w:tc>
+          <w:tcPr>
+            <w:tcW w:type="dxa" w:w="9504"/>
+            <w:shd w:fill="F4F1EA" w:val="clear"/>
+          </w:tcPr>
+          <w:p>
+            <w:r/>
+            <w:r>
+              <w:rPr>
+                <w:rFonts w:ascii="Calibri" w:hAnsi="Calibri" w:eastAsia="Calibri"/>
+                <w:b w:val="0"/>
+                <w:i w:val="0"/>
+                <w:color w:val="1E1A16"/>
+                <w:sz w:val="22"/>
+              </w:rPr>
+              <w:t>Relative humidity</w:t>
+            </w:r>
+          </w:p>
+        </w:tc>
+        <w:tc>
+          <w:tcPr>
+            <w:tcW w:type="dxa" w:w="9504"/>
+            <w:shd w:fill="F4F1EA" w:val="clear"/>
+          </w:tcPr>
+          <w:p>
+            <w:r/>
+            <w:r>
+              <w:rPr>
+                <w:rFonts w:ascii="Calibri" w:hAnsi="Calibri" w:eastAsia="Calibri"/>
+                <w:b w:val="0"/>
+                <w:i w:val="0"/>
+                <w:color w:val="1E1A16"/>
+                <w:sz w:val="22"/>
+              </w:rPr>
+              <w:t>At least 27% for at least 1 hour</w:t>
+            </w:r>
+          </w:p>
+        </w:tc>
+      </w:tr>
+      <w:tr>
+        <w:tc>
+          <w:tcPr>
+            <w:tcW w:type="dxa" w:w="9504"/>
+          </w:tcPr>
+          <w:p>
+            <w:r/>
+            <w:r>
+              <w:rPr>
+                <w:rFonts w:ascii="Calibri" w:hAnsi="Calibri" w:eastAsia="Calibri"/>
+                <w:b/>
+                <w:i w:val="0"/>
+                <w:color w:val="1E1A16"/>
+                <w:sz w:val="22"/>
+              </w:rPr>
+              <w:t>CCP 1 Cooking</w:t>
+            </w:r>
+          </w:p>
+        </w:tc>
+        <w:tc>
+          <w:tcPr>
+            <w:tcW w:type="dxa" w:w="9504"/>
+          </w:tcPr>
+          <w:p>
+            <w:r/>
+            <w:r>
+              <w:rPr>
+                <w:rFonts w:ascii="Calibri" w:hAnsi="Calibri" w:eastAsia="Calibri"/>
+                <w:b w:val="0"/>
+                <w:i w:val="0"/>
+                <w:color w:val="1E1A16"/>
+                <w:sz w:val="22"/>
+              </w:rPr>
+              <w:t>Sealed oven</w:t>
+            </w:r>
+          </w:p>
+        </w:tc>
+        <w:tc>
+          <w:tcPr>
+            <w:tcW w:type="dxa" w:w="9504"/>
+          </w:tcPr>
+          <w:p>
+            <w:r/>
+            <w:r>
+              <w:rPr>
+                <w:rFonts w:ascii="Calibri" w:hAnsi="Calibri" w:eastAsia="Calibri"/>
+                <w:b w:val="0"/>
+                <w:i w:val="0"/>
+                <w:color w:val="1E1A16"/>
+                <w:sz w:val="22"/>
+              </w:rPr>
+              <w:t>Dampers closed within 30 minutes, and kept closed for 1 hour or 50% of the cook, whichever is longer</w:t>
+            </w:r>
+          </w:p>
+        </w:tc>
+      </w:tr>
+      <w:tr>
+        <w:tc>
+          <w:tcPr>
+            <w:tcW w:type="dxa" w:w="9504"/>
+            <w:shd w:fill="F4F1EA" w:val="clear"/>
+          </w:tcPr>
+          <w:p>
+            <w:r/>
+            <w:r>
+              <w:rPr>
+                <w:rFonts w:ascii="Calibri" w:hAnsi="Calibri" w:eastAsia="Calibri"/>
+                <w:b/>
+                <w:i w:val="0"/>
+                <w:color w:val="1E1A16"/>
+                <w:sz w:val="22"/>
+              </w:rPr>
+              <w:t>CCP 1 Cooking</w:t>
+            </w:r>
+          </w:p>
+        </w:tc>
+        <w:tc>
+          <w:tcPr>
+            <w:tcW w:type="dxa" w:w="9504"/>
+            <w:shd w:fill="F4F1EA" w:val="clear"/>
           </w:tcPr>
           <w:p>
             <w:r/>
@@ -1487,6 +1305,7 @@
         <w:tc>
           <w:tcPr>
             <w:tcW w:type="dxa" w:w="9504"/>
+            <w:shd w:fill="F4F1EA" w:val="clear"/>
           </w:tcPr>
           <w:p>
             <w:r/>
@@ -1507,6 +1326,62 @@
         <w:tc>
           <w:tcPr>
             <w:tcW w:type="dxa" w:w="9504"/>
+          </w:tcPr>
+          <w:p>
+            <w:r/>
+            <w:r>
+              <w:rPr>
+                <w:rFonts w:ascii="Calibri" w:hAnsi="Calibri" w:eastAsia="Calibri"/>
+                <w:b/>
+                <w:i w:val="0"/>
+                <w:color w:val="1E1A16"/>
+                <w:sz w:val="22"/>
+              </w:rPr>
+              <w:t>CCP 2 Drying</w:t>
+            </w:r>
+          </w:p>
+        </w:tc>
+        <w:tc>
+          <w:tcPr>
+            <w:tcW w:type="dxa" w:w="9504"/>
+          </w:tcPr>
+          <w:p>
+            <w:r/>
+            <w:r>
+              <w:rPr>
+                <w:rFonts w:ascii="Calibri" w:hAnsi="Calibri" w:eastAsia="Calibri"/>
+                <w:b w:val="0"/>
+                <w:i w:val="0"/>
+                <w:color w:val="1E1A16"/>
+                <w:sz w:val="22"/>
+              </w:rPr>
+              <w:t>Dry bulb</w:t>
+            </w:r>
+          </w:p>
+        </w:tc>
+        <w:tc>
+          <w:tcPr>
+            <w:tcW w:type="dxa" w:w="9504"/>
+          </w:tcPr>
+          <w:p>
+            <w:r/>
+            <w:r>
+              <w:rPr>
+                <w:rFonts w:ascii="Calibri" w:hAnsi="Calibri" w:eastAsia="Calibri"/>
+                <w:b w:val="0"/>
+                <w:i w:val="0"/>
+                <w:color w:val="1E1A16"/>
+                <w:sz w:val="22"/>
+              </w:rPr>
+              <w:t>At least 170°F during drying</w:t>
+            </w:r>
+          </w:p>
+        </w:tc>
+      </w:tr>
+      <w:tr>
+        <w:tc>
+          <w:tcPr>
+            <w:tcW w:type="dxa" w:w="9504"/>
             <w:shd w:fill="F4F1EA" w:val="clear"/>
           </w:tcPr>
           <w:p>
@@ -1519,7 +1394,7 @@
                 <w:color w:val="1E1A16"/>
                 <w:sz w:val="22"/>
               </w:rPr>
-              <w:t>CCP-3 Drying</w:t>
+              <w:t>CCP 2 Drying</w:t>
             </w:r>
           </w:p>
         </w:tc>
@@ -1557,7 +1432,7 @@
                 <w:color w:val="1E1A16"/>
                 <w:sz w:val="22"/>
               </w:rPr>
-              <w:t>Below 0.88. The highest of three pieces.</w:t>
+              <w:t>0.85 or less. Highest of at least six pieces.</w:t>
             </w:r>
           </w:p>
         </w:tc>
@@ -1575,7 +1450,7 @@
           <w:color w:val="1E1A16"/>
           <w:sz w:val="22"/>
         </w:rPr>
-        <w:t>A blank or the word “yes” does not count. The measured number has to be written. If a number is missing, the lot does not ship.</w:t>
+        <w:t>A blank or the word “yes” does not count. The measured number has to be written. If a CCP number is missing, the lot does not ship. 9 CFR 417.5.</w:t>
       </w:r>
     </w:p>
     <w:p>
@@ -1590,7 +1465,7 @@
           <w:color w:val="4A433A"/>
           <w:sz w:val="18"/>
         </w:rPr>
-        <w:t>Carne Seca Jesus Canales, LLC · 411 E Main St, Delta, UT 84624 · Limits from the jerky verification sheet and FSIS Appendix A, December 2021.</w:t>
+        <w:t>Carne Seca Jesus Canales, LLC · 411 E Main St, Delta, UT 84624 · Limits from the FSIS beef jerky HACCP model (2021-0004) and Appendix A (December 2021).</w:t>
       </w:r>
     </w:p>
     <w:sectPr>

</xml_diff>